<commit_message>
Add internship period to the portfolio and CV
</commit_message>
<xml_diff>
--- a/assets/CV_Mark_Grintsin_EN.docx
+++ b/assets/CV_Mark_Grintsin_EN.docx
@@ -20,6 +20,17 @@
           <w:sz w:val="22"/>
         </w:rPr>
         <w:t>IT SYSTEMS STUDENT</w:t>
+      </w:r>
+    </w:p>
+    <w:p>
+      <w:pPr>
+        <w:spacing w:after="100"/>
+      </w:pPr>
+      <w:r>
+        <w:rPr>
+          <w:sz w:val="21"/>
+        </w:rPr>
+        <w:t>Erasmus+ internship in Spain  |  15 February - 9 May</w:t>
       </w:r>
     </w:p>
     <w:p>

</xml_diff>